<commit_message>
docs(legal): record the confirmed database region and the default regions of sign-in and email in the investor counsel pack
Co-Authored-By: Claude Sonnet 5.5 <noreply@anthropic.com>
</commit_message>
<xml_diff>
--- a/docs/legal/investor-side/Anker-investor-side-counsel-pack.docx
+++ b/docs/legal/investor-side/Anker-investor-side-counsel-pack.docx
@@ -15,7 +15,7 @@
         <w:pStyle w:val="Date"/>
       </w:pPr>
       <w:r>
-        <w:t xml:space="preserve">2026-10-21</w:t>
+        <w:t xml:space="preserve">2026-10-23</w:t>
       </w:r>
     </w:p>
     <w:sdt>
@@ -690,7 +690,7 @@
         <w:t xml:space="preserve"> </w:t>
       </w:r>
       <w:r>
-        <w:t xml:space="preserve">(each repeated where it matters): no virus scanner for attachments; no key rotation for the encryption key; the database region is the United States according to the sub-processor register; no formal breach runbook existed before this pack (a draft is in</w:t>
+        <w:t xml:space="preserve">(each repeated where it matters): no virus scanner for attachments; no key rotation for the encryption key; the database is in the United States (Neon, AWS us-east-1, confirmed), and sign-in and email are in default provider regions not yet read off; no formal breach runbook existed before this pack (a draft is in</w:t>
       </w:r>
       <w:r>
         <w:t xml:space="preserve"> </w:t>
@@ -1647,23 +1647,33 @@
         <w:t xml:space="preserve"> </w:t>
       </w:r>
       <w:r>
-        <w:t xml:space="preserve">Files are encrypted by the application (AES-256-GCM) in the database. The sub-processor register records the database provider’s region as</w:t>
-      </w:r>
-      <w:r>
-        <w:t xml:space="preserve"> </w:t>
-      </w:r>
-      <w:r>
-        <w:rPr>
-          <w:b/>
-          <w:bCs/>
-        </w:rPr>
-        <w:t xml:space="preserve">United States</w:t>
-      </w:r>
-      <w:r>
-        <w:t xml:space="preserve"> </w:t>
-      </w:r>
-      <w:r>
-        <w:t xml:space="preserve">(inferred), hosting as US, email and sign-in as not yet confirmed. Does storing EU residents’ identity documents there need a different region, SCCs or another measure before launch?</w:t>
+        <w:t xml:space="preserve">Files are encrypted by the application (AES-256-GCM) in the database. The database is hosted by Neon in</w:t>
+      </w:r>
+      <w:r>
+        <w:t xml:space="preserve"> </w:t>
+      </w:r>
+      <w:r>
+        <w:rPr>
+          <w:b/>
+          <w:bCs/>
+        </w:rPr>
+        <w:t xml:space="preserve">AWS us-east-1 (US East, N. Virginia)</w:t>
+      </w:r>
+      <w:r>
+        <w:t xml:space="preserve">: read from the connection address on 2026-10-23, so confirmed. Hosting (Vercel) is recorded as US (inferred). Sign-in (Supabase) and email delivery (Resend) run in</w:t>
+      </w:r>
+      <w:r>
+        <w:t xml:space="preserve"> </w:t>
+      </w:r>
+      <w:r>
+        <w:rPr>
+          <w:b/>
+          <w:bCs/>
+        </w:rPr>
+        <w:t xml:space="preserve">the providers’ default regions, which were not chosen deliberately</w:t>
+      </w:r>
+      <w:r>
+        <w:t xml:space="preserve">; the actual region of each is to be read from the provider’s dashboard (most likely US East for both, not verified). Does storing EU residents’ identity documents there, and sending them sign-in and email through default-region providers, need a different region, SCCs or another measure before launch?</w:t>
       </w:r>
       <w:r>
         <w:t xml:space="preserve"> </w:t>
@@ -4242,7 +4252,7 @@
         <w:t xml:space="preserve"> </w:t>
       </w:r>
       <w:r>
-        <w:t xml:space="preserve">The files are stored in the database, whose provider the sub-processor register records as US-region (inferred). EU residents’ identity documents therefore raise a transfer question before launch (question 19).</w:t>
+        <w:t xml:space="preserve">The files are stored in the database, hosted by Neon in AWS us-east-1 (US East), confirmed from the connection address on 2026-10-23. EU residents’ identity documents therefore raise a transfer question before launch (question 19). Sign-in (Supabase) and email (Resend) use default regions, to be read from their dashboards; neither holds identity documents (Resend carries only the six-digit codes and content-free notices).</w:t>
       </w:r>
     </w:p>
     <w:p>
@@ -6294,7 +6304,23 @@
         <w:t xml:space="preserve"> </w:t>
       </w:r>
       <w:r>
-        <w:t xml:space="preserve">(database; region US, inferred);</w:t>
+        <w:t xml:space="preserve">(database;</w:t>
+      </w:r>
+      <w:r>
+        <w:t xml:space="preserve"> </w:t>
+      </w:r>
+      <w:r>
+        <w:rPr>
+          <w:b/>
+          <w:bCs/>
+        </w:rPr>
+        <w:t xml:space="preserve">AWS us-east-1, US East (N. Virginia), confirmed</w:t>
+      </w:r>
+      <w:r>
+        <w:t xml:space="preserve"> </w:t>
+      </w:r>
+      <w:r>
+        <w:t xml:space="preserve">from the connection address on 2026-10-23);</w:t>
       </w:r>
       <w:r>
         <w:t xml:space="preserve"> </w:t>
@@ -6326,7 +6352,20 @@
         <w:t xml:space="preserve"> </w:t>
       </w:r>
       <w:r>
-        <w:t xml:space="preserve">(sign-in; region not yet confirmed);</w:t>
+        <w:t xml:space="preserve">(sign-in;</w:t>
+      </w:r>
+      <w:r>
+        <w:t xml:space="preserve"> </w:t>
+      </w:r>
+      <w:r>
+        <w:rPr>
+          <w:b/>
+          <w:bCs/>
+        </w:rPr>
+        <w:t xml:space="preserve">default region, not chosen deliberately</w:t>
+      </w:r>
+      <w:r>
+        <w:t xml:space="preserve">; the actual region is to be read from its dashboard);</w:t>
       </w:r>
       <w:r>
         <w:t xml:space="preserve"> </w:t>
@@ -6342,7 +6381,20 @@
         <w:t xml:space="preserve"> </w:t>
       </w:r>
       <w:r>
-        <w:t xml:space="preserve">(email delivery; region not yet confirmed; carries the six-digit codes and the content-free notices);</w:t>
+        <w:t xml:space="preserve">(email delivery;</w:t>
+      </w:r>
+      <w:r>
+        <w:t xml:space="preserve"> </w:t>
+      </w:r>
+      <w:r>
+        <w:rPr>
+          <w:b/>
+          <w:bCs/>
+        </w:rPr>
+        <w:t xml:space="preserve">default region, not chosen deliberately</w:t>
+      </w:r>
+      <w:r>
+        <w:t xml:space="preserve">; to be read from its dashboard; carries the six-digit codes and the content-free notices);</w:t>
       </w:r>
       <w:r>
         <w:t xml:space="preserve"> </w:t>
@@ -6416,7 +6468,19 @@
         <w:t xml:space="preserve"> </w:t>
       </w:r>
       <w:r>
-        <w:t xml:space="preserve">two regions are unconfirmed; the primary database is US-region by the register’s inference. Before launch the founder should confirm each provider’s region and DPA and, with counsel, decide on SCCs or a regional move (question 19).</w:t>
+        <w:t xml:space="preserve">the primary database is in the United States (confirmed); sign-in and email are in default regions whose actual location is not yet recorded; the public sub-processor register still shows them as</w:t>
+      </w:r>
+      <w:r>
+        <w:t xml:space="preserve"> </w:t>
+      </w:r>
+      <w:r>
+        <w:t xml:space="preserve">“not yet confirmed”</w:t>
+      </w:r>
+      <w:r>
+        <w:t xml:space="preserve"> </w:t>
+      </w:r>
+      <w:r>
+        <w:t xml:space="preserve">and should be updated once read. Before launch the founder should read each provider’s region from its dashboard, confirm each DPA and, with counsel, decide on SCCs or a regional move (question 19). Both providers offer EU regions; for Resend the sending domain’s region is set when the domain is created, so changing it means re-creating the domain.</w:t>
       </w:r>
     </w:p>
     <w:bookmarkEnd w:id="55"/>
@@ -10084,7 +10148,7 @@
         <w:t xml:space="preserve"> </w:t>
       </w:r>
       <w:r>
-        <w:t xml:space="preserve">[Regions; transfers outside the EU and the safeguards, once confirmed.]</w:t>
+        <w:t xml:space="preserve">Our database is hosted in the United States (AWS us-east-1, via Neon). [Sign-in and email regions: to be read from the providers’ dashboards. Transfers outside the EU and the safeguards, once counsel confirms.]</w:t>
       </w:r>
     </w:p>
     <w:p>

</xml_diff>

<commit_message>
docs(legal): fill the investor terms and notice from the existing privacy page and terms; add the launch checklist
Co-Authored-By: Claude Sonnet 5.5 <noreply@anthropic.com>
</commit_message>
<xml_diff>
--- a/docs/legal/investor-side/Anker-investor-side-counsel-pack.docx
+++ b/docs/legal/investor-side/Anker-investor-side-counsel-pack.docx
@@ -671,6 +671,18 @@
       <w:r>
         <w:t xml:space="preserve">: the runbooks that close the technical gaps.</w:t>
       </w:r>
+      <w:r>
+        <w:t xml:space="preserve"> </w:t>
+      </w:r>
+      <w:r>
+        <w:rPr>
+          <w:rStyle w:val="VerbatimChar"/>
+        </w:rPr>
+        <w:t xml:space="preserve">14-launch-checklist.md</w:t>
+      </w:r>
+      <w:r>
+        <w:t xml:space="preserve">: what is left, in order, with the supervised run step by step.</w:t>
+      </w:r>
     </w:p>
     <w:p>
       <w:pPr>
@@ -702,7 +714,7 @@
         <w:t xml:space="preserve"> </w:t>
       </w:r>
       <w:r>
-        <w:t xml:space="preserve">from the files in this folder (README, 00 to 13 in order,</w:t>
+        <w:t xml:space="preserve">from the files in this folder (README, 00 to 14 in order,</w:t>
       </w:r>
       <w:r>
         <w:t xml:space="preserve"> </w:t>
@@ -10595,7 +10607,7 @@
           <w:i/>
           <w:iCs/>
         </w:rPr>
-        <w:t xml:space="preserve">Version 2026-10-23-draft-1. Status: draft.</w:t>
+        <w:t xml:space="preserve">Version 2026-10-23-draft-2. Status: draft.</w:t>
       </w:r>
     </w:p>
     <w:bookmarkStart w:id="114" w:name="who-we-are"/>
@@ -10612,7 +10624,7 @@
         <w:pStyle w:val="FirstParagraph"/>
       </w:pPr>
       <w:r>
-        <w:t xml:space="preserve">[Company name, registered office, email, data-protection contact.] We run Anker, a platform for venture funds, founders and investors. For your investor account we decide how and why your data is used (we are the controller).</w:t>
+        <w:t xml:space="preserve">Anker AI [legal form and registered office in Berlin, Germany] runs Anker. Contact for anything about your data: privacy@an-ker.de [and the data-protection officer, if one is appointed]. We run Anker, a platform for venture funds, founders and investors. For your investor account we decide how and why your data is used (we are the controller).</w:t>
       </w:r>
     </w:p>
     <w:bookmarkEnd w:id="114"/>
@@ -10891,7 +10903,7 @@
         <w:pStyle w:val="FirstParagraph"/>
       </w:pPr>
       <w:r>
-        <w:t xml:space="preserve">Access and a copy (Download my data on your profile), correction (edit your profile), erasure (Delete my investor account), withdrawal of consent (switch off being found; take back a shared document), restriction and objection (write to [address]), and complaint to your supervisory authority [name].</w:t>
+        <w:t xml:space="preserve">Access and a copy (Download my data on your profile), correction (edit your profile), erasure (Delete my investor account), withdrawal of consent (switch off being found; take back a shared document), restriction and objection (write to privacy@an-ker.de), and complaint to your supervisory authority; if you live in Germany, or if our seat is in Berlin, that is the Berlin Commissioner for Data Protection and Freedom of Information, or the authority of the state where you live. [Counsel to confirm.]</w:t>
       </w:r>
     </w:p>
     <w:bookmarkEnd w:id="120"/>
@@ -10945,7 +10957,7 @@
         <w:pStyle w:val="FirstParagraph"/>
       </w:pPr>
       <w:r>
-        <w:t xml:space="preserve">[How you will be told of changes.]</w:t>
+        <w:t xml:space="preserve">If we change this notice in a way that matters, we will tell you by email or in the app and, if the change affects your terms, ask you to accept the new version.</w:t>
       </w:r>
     </w:p>
     <w:bookmarkEnd w:id="123"/>
@@ -10968,7 +10980,7 @@
           <w:i/>
           <w:iCs/>
         </w:rPr>
-        <w:t xml:space="preserve">Version 2026-10-23-draft-1. Status: draft.</w:t>
+        <w:t xml:space="preserve">Version 2026-10-23-draft-2. Status: draft.</w:t>
       </w:r>
     </w:p>
     <w:bookmarkStart w:id="125" w:name="who-these-terms-are-between"/>
@@ -10985,7 +10997,7 @@
         <w:pStyle w:val="FirstParagraph"/>
       </w:pPr>
       <w:r>
-        <w:t xml:space="preserve">These terms are between [company name, registered office] (“Anker”, “we”) and you, a person who has an investor account on Anker. If you use Anker for a company, trust, family office or other entity, “you” includes that entity and you confirm that you are allowed to act for it.</w:t>
+        <w:t xml:space="preserve">These terms are between Anker AI [legal form and registered office in Berlin, Germany] (“Anker”, “we”) and you, a person who has an investor account on Anker. If you use Anker for a company, trust, family office or other entity, “you” includes that entity and you confirm that you are allowed to act for it.</w:t>
       </w:r>
     </w:p>
     <w:bookmarkEnd w:id="125"/>
@@ -11279,7 +11291,7 @@
         <w:pStyle w:val="FirstParagraph"/>
       </w:pPr>
       <w:r>
-        <w:t xml:space="preserve">Anker is provided as it is available; [counsel: availability and warranty wording]. We may change these terms. If we change them in a way that matters we will ask you to accept the new version before you continue.</w:t>
+        <w:t xml:space="preserve">Anker is provided as it is available, and we do not promise that it will be uninterrupted or error-free, to the extent the law allows. We may change these terms. If we change them in a way that matters we will ask you to accept the new version before you continue.</w:t>
       </w:r>
     </w:p>
     <w:bookmarkEnd w:id="136"/>
@@ -11315,7 +11327,7 @@
         <w:pStyle w:val="FirstParagraph"/>
       </w:pPr>
       <w:r>
-        <w:t xml:space="preserve">[Counsel to supply.]</w:t>
+        <w:t xml:space="preserve">These terms are governed by the laws of Germany. If you are a consumer, mandatory rights under the law of the country where you live remain, and you may bring a claim in the courts there. Otherwise the courts of Berlin have jurisdiction. [Counsel to confirm.]</w:t>
       </w:r>
     </w:p>
     <w:bookmarkEnd w:id="138"/>
@@ -11333,7 +11345,7 @@
         <w:pStyle w:val="FirstParagraph"/>
       </w:pPr>
       <w:r>
-        <w:t xml:space="preserve">[Name, address and email for questions and notices.]</w:t>
+        <w:t xml:space="preserve">Questions and notices: privacy@an-ker.de for anything about your data; vc@an-ker.de for everything else. [Postal address.]</w:t>
       </w:r>
     </w:p>
     <w:bookmarkEnd w:id="139"/>
@@ -13119,6 +13131,1176 @@
     </w:p>
     <w:bookmarkEnd w:id="156"/>
     <w:bookmarkEnd w:id="157"/>
+    <w:bookmarkStart w:id="163" w:name="X4bbc51da0d0d0222a7f46ae019a99e1deb95c75"/>
+    <w:p>
+      <w:pPr>
+        <w:pStyle w:val="Heading1"/>
+      </w:pPr>
+      <w:r>
+        <w:t xml:space="preserve">14. Launch checklist: what is left, in order, and who does it</w:t>
+      </w:r>
+    </w:p>
+    <w:p>
+      <w:pPr>
+        <w:pStyle w:val="FirstParagraph"/>
+      </w:pPr>
+      <w:r>
+        <w:rPr>
+          <w:i/>
+          <w:iCs/>
+        </w:rPr>
+        <w:t xml:space="preserve">As of 2026-10-23. Everything that the code can do is done; what follows needs the founder, counsel or a provider account. Each step says how to know it is done.</w:t>
+      </w:r>
+    </w:p>
+    <w:bookmarkStart w:id="158" w:name="Xee37e457e2ae8d156c364f885929b8952b0cc5c"/>
+    <w:p>
+      <w:pPr>
+        <w:pStyle w:val="Heading2"/>
+      </w:pPr>
+      <w:r>
+        <w:t xml:space="preserve">A. Facts only you can supply (about an hour)</w:t>
+      </w:r>
+    </w:p>
+    <w:p>
+      <w:pPr>
+        <w:pStyle w:val="Compact"/>
+        <w:numPr>
+          <w:ilvl w:val="0"/>
+          <w:numId w:val="1041"/>
+        </w:numPr>
+      </w:pPr>
+      <w:r>
+        <w:rPr>
+          <w:b/>
+          <w:bCs/>
+        </w:rPr>
+        <w:t xml:space="preserve">Regions.</w:t>
+      </w:r>
+      <w:r>
+        <w:t xml:space="preserve"> </w:t>
+      </w:r>
+      <w:r>
+        <w:t xml:space="preserve">In your own shell:</w:t>
+      </w:r>
+      <w:r>
+        <w:t xml:space="preserve"> </w:t>
+      </w:r>
+      <w:r>
+        <w:rPr>
+          <w:rStyle w:val="VerbatimChar"/>
+        </w:rPr>
+        <w:t xml:space="preserve">node scripts/legal/read-regions.mjs</w:t>
+      </w:r>
+      <w:r>
+        <w:t xml:space="preserve"> </w:t>
+      </w:r>
+      <w:r>
+        <w:t xml:space="preserve">(add</w:t>
+      </w:r>
+      <w:r>
+        <w:t xml:space="preserve"> </w:t>
+      </w:r>
+      <w:r>
+        <w:rPr>
+          <w:rStyle w:val="VerbatimChar"/>
+        </w:rPr>
+        <w:t xml:space="preserve">RESEND_API_KEY=…</w:t>
+      </w:r>
+      <w:r>
+        <w:t xml:space="preserve"> </w:t>
+      </w:r>
+      <w:r>
+        <w:t xml:space="preserve">and</w:t>
+      </w:r>
+      <w:r>
+        <w:t xml:space="preserve"> </w:t>
+      </w:r>
+      <w:r>
+        <w:rPr>
+          <w:rStyle w:val="VerbatimChar"/>
+        </w:rPr>
+        <w:t xml:space="preserve">SUPABASE_ACCESS_TOKEN=…</w:t>
+      </w:r>
+      <w:r>
+        <w:t xml:space="preserve"> </w:t>
+      </w:r>
+      <w:r>
+        <w:t xml:space="preserve">and</w:t>
+      </w:r>
+      <w:r>
+        <w:t xml:space="preserve"> </w:t>
+      </w:r>
+      <w:r>
+        <w:rPr>
+          <w:rStyle w:val="VerbatimChar"/>
+        </w:rPr>
+        <w:t xml:space="preserve">NEXT_PUBLIC_SUPABASE_URL=…</w:t>
+      </w:r>
+      <w:r>
+        <w:t xml:space="preserve"> </w:t>
+      </w:r>
+      <w:r>
+        <w:t xml:space="preserve">for the two lookups, or read both from the dashboards).</w:t>
+      </w:r>
+      <w:r>
+        <w:t xml:space="preserve"> </w:t>
+      </w:r>
+      <w:r>
+        <w:rPr>
+          <w:i/>
+          <w:iCs/>
+        </w:rPr>
+        <w:t xml:space="preserve">Done when:</w:t>
+      </w:r>
+      <w:r>
+        <w:t xml:space="preserve"> </w:t>
+      </w:r>
+      <w:r>
+        <w:t xml:space="preserve">you can write down the region of the database (known: AWS us-east-1), sign-in and email, and have updated the sub-processor register (the</w:t>
+      </w:r>
+      <w:r>
+        <w:t xml:space="preserve"> </w:t>
+      </w:r>
+      <w:r>
+        <w:rPr>
+          <w:rStyle w:val="VerbatimChar"/>
+        </w:rPr>
+        <w:t xml:space="preserve">/privacy/subprocessors</w:t>
+      </w:r>
+      <w:r>
+        <w:t xml:space="preserve"> </w:t>
+      </w:r>
+      <w:r>
+        <w:t xml:space="preserve">page reads it) and the</w:t>
+      </w:r>
+      <w:r>
+        <w:t xml:space="preserve"> </w:t>
+      </w:r>
+      <w:r>
+        <w:t xml:space="preserve">“Where”</w:t>
+      </w:r>
+      <w:r>
+        <w:t xml:space="preserve"> </w:t>
+      </w:r>
+      <w:r>
+        <w:t xml:space="preserve">section of the notice (</w:t>
+      </w:r>
+      <w:r>
+        <w:rPr>
+          <w:rStyle w:val="VerbatimChar"/>
+        </w:rPr>
+        <w:t xml:space="preserve">lib/investor/terms-text.ts</w:t>
+      </w:r>
+      <w:r>
+        <w:t xml:space="preserve">).</w:t>
+      </w:r>
+    </w:p>
+    <w:p>
+      <w:pPr>
+        <w:pStyle w:val="Compact"/>
+        <w:numPr>
+          <w:ilvl w:val="0"/>
+          <w:numId w:val="1041"/>
+        </w:numPr>
+      </w:pPr>
+      <w:r>
+        <w:rPr>
+          <w:b/>
+          <w:bCs/>
+        </w:rPr>
+        <w:t xml:space="preserve">Company details.</w:t>
+      </w:r>
+      <w:r>
+        <w:t xml:space="preserve"> </w:t>
+      </w:r>
+      <w:r>
+        <w:t xml:space="preserve">Replace</w:t>
+      </w:r>
+      <w:r>
+        <w:t xml:space="preserve"> </w:t>
+      </w:r>
+      <w:r>
+        <w:rPr>
+          <w:rStyle w:val="VerbatimChar"/>
+        </w:rPr>
+        <w:t xml:space="preserve">[legal form and registered office in Berlin, Germany]</w:t>
+      </w:r>
+      <w:r>
+        <w:t xml:space="preserve"> </w:t>
+      </w:r>
+      <w:r>
+        <w:t xml:space="preserve">and</w:t>
+      </w:r>
+      <w:r>
+        <w:t xml:space="preserve"> </w:t>
+      </w:r>
+      <w:r>
+        <w:rPr>
+          <w:rStyle w:val="VerbatimChar"/>
+        </w:rPr>
+        <w:t xml:space="preserve">[Postal address]</w:t>
+      </w:r>
+      <w:r>
+        <w:t xml:space="preserve"> </w:t>
+      </w:r>
+      <w:r>
+        <w:t xml:space="preserve">in</w:t>
+      </w:r>
+      <w:r>
+        <w:t xml:space="preserve"> </w:t>
+      </w:r>
+      <w:r>
+        <w:rPr>
+          <w:rStyle w:val="VerbatimChar"/>
+        </w:rPr>
+        <w:t xml:space="preserve">lib/investor/terms-text.ts</w:t>
+      </w:r>
+      <w:r>
+        <w:t xml:space="preserve">. The controller name (Anker AI), the contact addresses and the governing law are taken from the existing privacy page and terms; check they are right.</w:t>
+      </w:r>
+    </w:p>
+    <w:bookmarkEnd w:id="158"/>
+    <w:bookmarkStart w:id="159" w:name="b.-decisions"/>
+    <w:p>
+      <w:pPr>
+        <w:pStyle w:val="Heading2"/>
+      </w:pPr>
+      <w:r>
+        <w:t xml:space="preserve">B. Decisions</w:t>
+      </w:r>
+    </w:p>
+    <w:p>
+      <w:pPr>
+        <w:pStyle w:val="Compact"/>
+        <w:numPr>
+          <w:ilvl w:val="0"/>
+          <w:numId w:val="1042"/>
+        </w:numPr>
+      </w:pPr>
+      <w:r>
+        <w:rPr>
+          <w:b/>
+          <w:bCs/>
+        </w:rPr>
+        <w:t xml:space="preserve">The database.</w:t>
+      </w:r>
+      <w:r>
+        <w:t xml:space="preserve"> </w:t>
+      </w:r>
+      <w:r>
+        <w:t xml:space="preserve">Decide: open with the US database (and counsel’s view on transfers), or move to the EU first (</w:t>
+      </w:r>
+      <w:r>
+        <w:rPr>
+          <w:rStyle w:val="VerbatimChar"/>
+        </w:rPr>
+        <w:t xml:space="preserve">12-eu-region-runbook.md</w:t>
+      </w:r>
+      <w:r>
+        <w:t xml:space="preserve">). The passport waits for this either way (</w:t>
+      </w:r>
+      <w:r>
+        <w:rPr>
+          <w:rStyle w:val="VerbatimChar"/>
+        </w:rPr>
+        <w:t xml:space="preserve">investor_passport</w:t>
+      </w:r>
+      <w:r>
+        <w:t xml:space="preserve">, off).</w:t>
+      </w:r>
+    </w:p>
+    <w:p>
+      <w:pPr>
+        <w:pStyle w:val="Compact"/>
+        <w:numPr>
+          <w:ilvl w:val="0"/>
+          <w:numId w:val="1042"/>
+        </w:numPr>
+      </w:pPr>
+      <w:r>
+        <w:rPr>
+          <w:b/>
+          <w:bCs/>
+        </w:rPr>
+        <w:t xml:space="preserve">Scanning.</w:t>
+      </w:r>
+      <w:r>
+        <w:t xml:space="preserve"> </w:t>
+      </w:r>
+      <w:r>
+        <w:t xml:space="preserve">Decide whether launch needs</w:t>
+      </w:r>
+      <w:r>
+        <w:t xml:space="preserve"> </w:t>
+      </w:r>
+      <w:r>
+        <w:rPr>
+          <w:rStyle w:val="VerbatimChar"/>
+        </w:rPr>
+        <w:t xml:space="preserve">INVESTOR_SCAN=required</w:t>
+      </w:r>
+      <w:r>
+        <w:t xml:space="preserve">. If yes: a small EU server running</w:t>
+      </w:r>
+      <w:r>
+        <w:t xml:space="preserve"> </w:t>
+      </w:r>
+      <w:r>
+        <w:rPr>
+          <w:rStyle w:val="VerbatimChar"/>
+        </w:rPr>
+        <w:t xml:space="preserve">ops/clamav/docker-compose.yml</w:t>
+      </w:r>
+      <w:r>
+        <w:t xml:space="preserve">, then</w:t>
+      </w:r>
+      <w:r>
+        <w:t xml:space="preserve"> </w:t>
+      </w:r>
+      <w:r>
+        <w:rPr>
+          <w:rStyle w:val="VerbatimChar"/>
+        </w:rPr>
+        <w:t xml:space="preserve">CLAMAV_HOST</w:t>
+      </w:r>
+      <w:r>
+        <w:t xml:space="preserve"> </w:t>
+      </w:r>
+      <w:r>
+        <w:t xml:space="preserve">in the hosting environment,</w:t>
+      </w:r>
+      <w:r>
+        <w:t xml:space="preserve"> </w:t>
+      </w:r>
+      <w:r>
+        <w:rPr>
+          <w:rStyle w:val="VerbatimChar"/>
+        </w:rPr>
+        <w:t xml:space="preserve">INVESTOR_SCAN=optional</w:t>
+      </w:r>
+      <w:r>
+        <w:t xml:space="preserve">, test with the EICAR file, then</w:t>
+      </w:r>
+      <w:r>
+        <w:t xml:space="preserve"> </w:t>
+      </w:r>
+      <w:r>
+        <w:rPr>
+          <w:rStyle w:val="VerbatimChar"/>
+        </w:rPr>
+        <w:t xml:space="preserve">required</w:t>
+      </w:r>
+      <w:r>
+        <w:t xml:space="preserve"> </w:t>
+      </w:r>
+      <w:r>
+        <w:t xml:space="preserve">(</w:t>
+      </w:r>
+      <w:r>
+        <w:rPr>
+          <w:rStyle w:val="VerbatimChar"/>
+        </w:rPr>
+        <w:t xml:space="preserve">13-virus-scanning-runbook.md</w:t>
+      </w:r>
+      <w:r>
+        <w:t xml:space="preserve">).</w:t>
+      </w:r>
+    </w:p>
+    <w:p>
+      <w:pPr>
+        <w:pStyle w:val="Compact"/>
+        <w:numPr>
+          <w:ilvl w:val="0"/>
+          <w:numId w:val="1042"/>
+        </w:numPr>
+      </w:pPr>
+      <w:r>
+        <w:rPr>
+          <w:b/>
+          <w:bCs/>
+        </w:rPr>
+        <w:t xml:space="preserve">Key.</w:t>
+      </w:r>
+      <w:r>
+        <w:t xml:space="preserve"> </w:t>
+      </w:r>
+      <w:r>
+        <w:t xml:space="preserve">Confirm the key can stay an environment variable; know where the secret is kept besides the host (</w:t>
+      </w:r>
+      <w:r>
+        <w:rPr>
+          <w:rStyle w:val="VerbatimChar"/>
+        </w:rPr>
+        <w:t xml:space="preserve">11-key-management.md</w:t>
+      </w:r>
+      <w:r>
+        <w:t xml:space="preserve">).</w:t>
+      </w:r>
+    </w:p>
+    <w:bookmarkEnd w:id="159"/>
+    <w:bookmarkStart w:id="160" w:name="c.-counsel"/>
+    <w:p>
+      <w:pPr>
+        <w:pStyle w:val="Heading2"/>
+      </w:pPr>
+      <w:r>
+        <w:t xml:space="preserve">C. Counsel</w:t>
+      </w:r>
+    </w:p>
+    <w:p>
+      <w:pPr>
+        <w:pStyle w:val="Compact"/>
+        <w:numPr>
+          <w:ilvl w:val="0"/>
+          <w:numId w:val="1043"/>
+        </w:numPr>
+      </w:pPr>
+      <w:r>
+        <w:rPr>
+          <w:b/>
+          <w:bCs/>
+        </w:rPr>
+        <w:t xml:space="preserve">Send the pack</w:t>
+      </w:r>
+      <w:r>
+        <w:t xml:space="preserve"> </w:t>
+      </w:r>
+      <w:r>
+        <w:t xml:space="preserve">(</w:t>
+      </w:r>
+      <w:r>
+        <w:rPr>
+          <w:rStyle w:val="VerbatimChar"/>
+        </w:rPr>
+        <w:t xml:space="preserve">Anker-investor-side-counsel-pack.docx</w:t>
+      </w:r>
+      <w:r>
+        <w:t xml:space="preserve">). Questions marked</w:t>
+      </w:r>
+      <w:r>
+        <w:t xml:space="preserve"> </w:t>
+      </w:r>
+      <w:r>
+        <w:rPr>
+          <w:b/>
+          <w:bCs/>
+        </w:rPr>
+        <w:t xml:space="preserve">B</w:t>
+      </w:r>
+      <w:r>
+        <w:t xml:space="preserve"> </w:t>
+      </w:r>
+      <w:r>
+        <w:t xml:space="preserve">in</w:t>
+      </w:r>
+      <w:r>
+        <w:t xml:space="preserve"> </w:t>
+      </w:r>
+      <w:r>
+        <w:rPr>
+          <w:rStyle w:val="VerbatimChar"/>
+        </w:rPr>
+        <w:t xml:space="preserve">00-counsel-brief.md</w:t>
+      </w:r>
+      <w:r>
+        <w:t xml:space="preserve"> </w:t>
+      </w:r>
+      <w:r>
+        <w:t xml:space="preserve">come first.</w:t>
+      </w:r>
+    </w:p>
+    <w:p>
+      <w:pPr>
+        <w:pStyle w:val="Compact"/>
+        <w:numPr>
+          <w:ilvl w:val="0"/>
+          <w:numId w:val="1043"/>
+        </w:numPr>
+      </w:pPr>
+      <w:r>
+        <w:rPr>
+          <w:b/>
+          <w:bCs/>
+        </w:rPr>
+        <w:t xml:space="preserve">Apply counsel’s answers</w:t>
+      </w:r>
+      <w:r>
+        <w:t xml:space="preserve"> </w:t>
+      </w:r>
+      <w:r>
+        <w:t xml:space="preserve">in one place each: wording in</w:t>
+      </w:r>
+      <w:r>
+        <w:t xml:space="preserve"> </w:t>
+      </w:r>
+      <w:r>
+        <w:rPr>
+          <w:rStyle w:val="VerbatimChar"/>
+        </w:rPr>
+        <w:t xml:space="preserve">lib/investor/legal.ts</w:t>
+      </w:r>
+      <w:r>
+        <w:t xml:space="preserve"> </w:t>
+      </w:r>
+      <w:r>
+        <w:t xml:space="preserve">(raise</w:t>
+      </w:r>
+      <w:r>
+        <w:t xml:space="preserve"> </w:t>
+      </w:r>
+      <w:r>
+        <w:rPr>
+          <w:rStyle w:val="VerbatimChar"/>
+        </w:rPr>
+        <w:t xml:space="preserve">LEGAL_VERSION</w:t>
+      </w:r>
+      <w:r>
+        <w:t xml:space="preserve">, regenerate with</w:t>
+      </w:r>
+      <w:r>
+        <w:t xml:space="preserve"> </w:t>
+      </w:r>
+      <w:r>
+        <w:rPr>
+          <w:rStyle w:val="VerbatimChar"/>
+        </w:rPr>
+        <w:t xml:space="preserve">npx tsx scripts/legal/gen-investor-pack.ts</w:t>
+      </w:r>
+      <w:r>
+        <w:t xml:space="preserve">, update the two pinned hashes in</w:t>
+      </w:r>
+      <w:r>
+        <w:t xml:space="preserve"> </w:t>
+      </w:r>
+      <w:r>
+        <w:rPr>
+          <w:rStyle w:val="VerbatimChar"/>
+        </w:rPr>
+        <w:t xml:space="preserve">lib/investor/legal.test.ts</w:t>
+      </w:r>
+      <w:r>
+        <w:t xml:space="preserve">); terms and notice in</w:t>
+      </w:r>
+      <w:r>
+        <w:t xml:space="preserve"> </w:t>
+      </w:r>
+      <w:r>
+        <w:rPr>
+          <w:rStyle w:val="VerbatimChar"/>
+        </w:rPr>
+        <w:t xml:space="preserve">lib/investor/terms-text.ts</w:t>
+      </w:r>
+      <w:r>
+        <w:t xml:space="preserve"> </w:t>
+      </w:r>
+      <w:r>
+        <w:t xml:space="preserve">(raise</w:t>
+      </w:r>
+      <w:r>
+        <w:t xml:space="preserve"> </w:t>
+      </w:r>
+      <w:r>
+        <w:rPr>
+          <w:rStyle w:val="VerbatimChar"/>
+        </w:rPr>
+        <w:t xml:space="preserve">INVESTOR_TERMS_VERSION</w:t>
+      </w:r>
+      <w:r>
+        <w:t xml:space="preserve">; set</w:t>
+      </w:r>
+      <w:r>
+        <w:t xml:space="preserve"> </w:t>
+      </w:r>
+      <w:r>
+        <w:rPr>
+          <w:rStyle w:val="VerbatimChar"/>
+        </w:rPr>
+        <w:t xml:space="preserve">TERMS_STATUS</w:t>
+      </w:r>
+      <w:r>
+        <w:t xml:space="preserve"> </w:t>
+      </w:r>
+      <w:r>
+        <w:t xml:space="preserve">to</w:t>
+      </w:r>
+      <w:r>
+        <w:t xml:space="preserve"> </w:t>
+      </w:r>
+      <w:r>
+        <w:rPr>
+          <w:rStyle w:val="VerbatimChar"/>
+        </w:rPr>
+        <w:t xml:space="preserve">"approved"</w:t>
+      </w:r>
+      <w:r>
+        <w:t xml:space="preserve"> </w:t>
+      </w:r>
+      <w:r>
+        <w:t xml:space="preserve">only when no</w:t>
+      </w:r>
+      <w:r>
+        <w:t xml:space="preserve"> </w:t>
+      </w:r>
+      <w:r>
+        <w:rPr>
+          <w:rStyle w:val="VerbatimChar"/>
+        </w:rPr>
+        <w:t xml:space="preserve">[bracket]</w:t>
+      </w:r>
+      <w:r>
+        <w:t xml:space="preserve"> </w:t>
+      </w:r>
+      <w:r>
+        <w:t xml:space="preserve">is left: the tests enforce it); retention periods in</w:t>
+      </w:r>
+      <w:r>
+        <w:t xml:space="preserve"> </w:t>
+      </w:r>
+      <w:r>
+        <w:rPr>
+          <w:rStyle w:val="VerbatimChar"/>
+        </w:rPr>
+        <w:t xml:space="preserve">lib/investor/retention-policy.ts</w:t>
+      </w:r>
+      <w:r>
+        <w:t xml:space="preserve">.</w:t>
+      </w:r>
+      <w:r>
+        <w:t xml:space="preserve"> </w:t>
+      </w:r>
+      <w:r>
+        <w:rPr>
+          <w:i/>
+          <w:iCs/>
+        </w:rPr>
+        <w:t xml:space="preserve">Done when:</w:t>
+      </w:r>
+      <w:r>
+        <w:t xml:space="preserve"> </w:t>
+      </w:r>
+      <w:r>
+        <w:rPr>
+          <w:rStyle w:val="VerbatimChar"/>
+        </w:rPr>
+        <w:t xml:space="preserve">pnpm test</w:t>
+      </w:r>
+      <w:r>
+        <w:t xml:space="preserve"> </w:t>
+      </w:r>
+      <w:r>
+        <w:t xml:space="preserve">passes and the draft banner is gone.</w:t>
+      </w:r>
+    </w:p>
+    <w:bookmarkEnd w:id="160"/>
+    <w:bookmarkStart w:id="161" w:name="Xb452d7460af13372b392392f6cbbd5bb64a1eb5"/>
+    <w:p>
+      <w:pPr>
+        <w:pStyle w:val="Heading2"/>
+      </w:pPr>
+      <w:r>
+        <w:t xml:space="preserve">D. The supervised run (before the first real investor)</w:t>
+      </w:r>
+    </w:p>
+    <w:p>
+      <w:pPr>
+        <w:pStyle w:val="FirstParagraph"/>
+      </w:pPr>
+      <w:r>
+        <w:t xml:space="preserve">Use a throwaway fund and your own addresses; keep the other switches off.</w:t>
+      </w:r>
+      <w:r>
+        <w:t xml:space="preserve"> </w:t>
+      </w:r>
+      <w:r>
+        <w:t xml:space="preserve">1.</w:t>
+      </w:r>
+      <w:r>
+        <w:t xml:space="preserve"> </w:t>
+      </w:r>
+      <w:r>
+        <w:rPr>
+          <w:b/>
+          <w:bCs/>
+        </w:rPr>
+        <w:t xml:space="preserve">A throwaway fund and workspace.</w:t>
+      </w:r>
+      <w:r>
+        <w:t xml:space="preserve"> </w:t>
+      </w:r>
+      <w:r>
+        <w:t xml:space="preserve">In a test workspace create a fund, set the fund profile (sectors, geography, stage, minimum commitment, thesis), then on</w:t>
+      </w:r>
+      <w:r>
+        <w:t xml:space="preserve"> </w:t>
+      </w:r>
+      <w:r>
+        <w:rPr>
+          <w:i/>
+          <w:iCs/>
+        </w:rPr>
+        <w:t xml:space="preserve">Investors</w:t>
+      </w:r>
+      <w:r>
+        <w:t xml:space="preserve"> </w:t>
+      </w:r>
+      <w:r>
+        <w:t xml:space="preserve">set the rules, tick strict mode, and press</w:t>
+      </w:r>
+      <w:r>
+        <w:t xml:space="preserve"> </w:t>
+      </w:r>
+      <w:r>
+        <w:rPr>
+          <w:i/>
+          <w:iCs/>
+        </w:rPr>
+        <w:t xml:space="preserve">Show to investors</w:t>
+      </w:r>
+      <w:r>
+        <w:t xml:space="preserve">.</w:t>
+      </w:r>
+      <w:r>
+        <w:t xml:space="preserve"> </w:t>
+      </w:r>
+      <w:r>
+        <w:rPr>
+          <w:i/>
+          <w:iCs/>
+        </w:rPr>
+        <w:t xml:space="preserve">Check:</w:t>
+      </w:r>
+      <w:r>
+        <w:t xml:space="preserve"> </w:t>
+      </w:r>
+      <w:r>
+        <w:t xml:space="preserve">the fund appears to an investor and to nobody else.</w:t>
+      </w:r>
+      <w:r>
+        <w:t xml:space="preserve"> </w:t>
+      </w:r>
+      <w:r>
+        <w:t xml:space="preserve">2.</w:t>
+      </w:r>
+      <w:r>
+        <w:t xml:space="preserve"> </w:t>
+      </w:r>
+      <w:r>
+        <w:rPr>
+          <w:b/>
+          <w:bCs/>
+        </w:rPr>
+        <w:t xml:space="preserve">Open sign-up briefly.</w:t>
+      </w:r>
+      <w:r>
+        <w:t xml:space="preserve"> </w:t>
+      </w:r>
+      <w:r>
+        <w:t xml:space="preserve">Set</w:t>
+      </w:r>
+      <w:r>
+        <w:t xml:space="preserve"> </w:t>
+      </w:r>
+      <w:r>
+        <w:rPr>
+          <w:rStyle w:val="VerbatimChar"/>
+        </w:rPr>
+        <w:t xml:space="preserve">investor_signup</w:t>
+      </w:r>
+      <w:r>
+        <w:t xml:space="preserve"> </w:t>
+      </w:r>
+      <w:r>
+        <w:t xml:space="preserve">to on (</w:t>
+      </w:r>
+      <w:r>
+        <w:rPr>
+          <w:rStyle w:val="VerbatimChar"/>
+        </w:rPr>
+        <w:t xml:space="preserve">UPDATE platform_flags SET enabled = true WHERE key = 'investor_signup'</w:t>
+      </w:r>
+      <w:r>
+        <w:t xml:space="preserve">, or the flag tool). Sign up with a fresh address.</w:t>
+      </w:r>
+      <w:r>
+        <w:t xml:space="preserve"> </w:t>
+      </w:r>
+      <w:r>
+        <w:rPr>
+          <w:i/>
+          <w:iCs/>
+        </w:rPr>
+        <w:t xml:space="preserve">Check:</w:t>
+      </w:r>
+      <w:r>
+        <w:t xml:space="preserve"> </w:t>
+      </w:r>
+      <w:r>
+        <w:t xml:space="preserve">the code email arrives and holds only the code; no account exists before the code; the password step creates the account; you land on</w:t>
+      </w:r>
+      <w:r>
+        <w:t xml:space="preserve"> </w:t>
+      </w:r>
+      <w:r>
+        <w:rPr>
+          <w:rStyle w:val="VerbatimChar"/>
+        </w:rPr>
+        <w:t xml:space="preserve">/investor</w:t>
+      </w:r>
+      <w:r>
+        <w:t xml:space="preserve">; the terms and notice links open the draft pages.</w:t>
+      </w:r>
+      <w:r>
+        <w:t xml:space="preserve"> </w:t>
+      </w:r>
+      <w:r>
+        <w:t xml:space="preserve">3.</w:t>
+      </w:r>
+      <w:r>
+        <w:t xml:space="preserve"> </w:t>
+      </w:r>
+      <w:r>
+        <w:rPr>
+          <w:b/>
+          <w:bCs/>
+        </w:rPr>
+        <w:t xml:space="preserve">Find, ask, talk.</w:t>
+      </w:r>
+      <w:r>
+        <w:t xml:space="preserve"> </w:t>
+      </w:r>
+      <w:r>
+        <w:t xml:space="preserve">Create an entity with interests; open</w:t>
+      </w:r>
+      <w:r>
+        <w:t xml:space="preserve"> </w:t>
+      </w:r>
+      <w:r>
+        <w:rPr>
+          <w:i/>
+          <w:iCs/>
+        </w:rPr>
+        <w:t xml:space="preserve">Find a fund</w:t>
+      </w:r>
+      <w:r>
+        <w:t xml:space="preserve">; open the fund; send a request.</w:t>
+      </w:r>
+      <w:r>
+        <w:t xml:space="preserve"> </w:t>
+      </w:r>
+      <w:r>
+        <w:rPr>
+          <w:i/>
+          <w:iCs/>
+        </w:rPr>
+        <w:t xml:space="preserve">Check:</w:t>
+      </w:r>
+      <w:r>
+        <w:t xml:space="preserve"> </w:t>
+      </w:r>
+      <w:r>
+        <w:t xml:space="preserve">the fund workspace gets an in-app notice; accept it; the investor gets a content-free email; exchange messages; attach a PDF and an image (try the EICAR file and an active-content PDF: both must be refused); accept the fund’s NDA; share a document from the data room; propose a meeting.</w:t>
+      </w:r>
+      <w:r>
+        <w:t xml:space="preserve"> </w:t>
+      </w:r>
+      <w:r>
+        <w:t xml:space="preserve">4.</w:t>
+      </w:r>
+      <w:r>
+        <w:t xml:space="preserve"> </w:t>
+      </w:r>
+      <w:r>
+        <w:rPr>
+          <w:b/>
+          <w:bCs/>
+        </w:rPr>
+        <w:t xml:space="preserve">Onboarding.</w:t>
+      </w:r>
+      <w:r>
+        <w:t xml:space="preserve"> </w:t>
+      </w:r>
+      <w:r>
+        <w:t xml:space="preserve">Press</w:t>
+      </w:r>
+      <w:r>
+        <w:t xml:space="preserve"> </w:t>
+      </w:r>
+      <w:r>
+        <w:rPr>
+          <w:i/>
+          <w:iCs/>
+        </w:rPr>
+        <w:t xml:space="preserve">Invite to onboard</w:t>
+      </w:r>
+      <w:r>
+        <w:t xml:space="preserve">.</w:t>
+      </w:r>
+      <w:r>
+        <w:t xml:space="preserve"> </w:t>
+      </w:r>
+      <w:r>
+        <w:rPr>
+          <w:i/>
+          <w:iCs/>
+        </w:rPr>
+        <w:t xml:space="preserve">Check:</w:t>
+      </w:r>
+      <w:r>
+        <w:t xml:space="preserve"> </w:t>
+      </w:r>
+      <w:r>
+        <w:t xml:space="preserve">an investor record appears in the fund’s LP list; the doc 60 invitation email arrives; the stage follows as you progress.</w:t>
+      </w:r>
+      <w:r>
+        <w:t xml:space="preserve"> </w:t>
+      </w:r>
+      <w:r>
+        <w:t xml:space="preserve">5.</w:t>
+      </w:r>
+      <w:r>
+        <w:t xml:space="preserve"> </w:t>
+      </w:r>
+      <w:r>
+        <w:rPr>
+          <w:b/>
+          <w:bCs/>
+        </w:rPr>
+        <w:t xml:space="preserve">The passport (only if you decided to open it).</w:t>
+      </w:r>
+      <w:r>
+        <w:t xml:space="preserve"> </w:t>
+      </w:r>
+      <w:r>
+        <w:t xml:space="preserve">Turn</w:t>
+      </w:r>
+      <w:r>
+        <w:t xml:space="preserve"> </w:t>
+      </w:r>
+      <w:r>
+        <w:rPr>
+          <w:rStyle w:val="VerbatimChar"/>
+        </w:rPr>
+        <w:t xml:space="preserve">investor_passport</w:t>
+      </w:r>
+      <w:r>
+        <w:t xml:space="preserve"> </w:t>
+      </w:r>
+      <w:r>
+        <w:t xml:space="preserve">on; add a document; share it with the fund; take it back; check the fund’s copy is deleted if unseen and retained if checked.</w:t>
+      </w:r>
+      <w:r>
+        <w:t xml:space="preserve"> </w:t>
+      </w:r>
+      <w:r>
+        <w:t xml:space="preserve">6.</w:t>
+      </w:r>
+      <w:r>
+        <w:t xml:space="preserve"> </w:t>
+      </w:r>
+      <w:r>
+        <w:rPr>
+          <w:b/>
+          <w:bCs/>
+        </w:rPr>
+        <w:t xml:space="preserve">Teams.</w:t>
+      </w:r>
+      <w:r>
+        <w:t xml:space="preserve"> </w:t>
+      </w:r>
+      <w:r>
+        <w:t xml:space="preserve">Invite a second address as</w:t>
+      </w:r>
+      <w:r>
+        <w:t xml:space="preserve"> </w:t>
+      </w:r>
+      <w:r>
+        <w:rPr>
+          <w:i/>
+          <w:iCs/>
+        </w:rPr>
+        <w:t xml:space="preserve">can view</w:t>
+      </w:r>
+      <w:r>
+        <w:t xml:space="preserve"> </w:t>
+      </w:r>
+      <w:r>
+        <w:t xml:space="preserve">and another as</w:t>
+      </w:r>
+      <w:r>
+        <w:t xml:space="preserve"> </w:t>
+      </w:r>
+      <w:r>
+        <w:rPr>
+          <w:i/>
+          <w:iCs/>
+        </w:rPr>
+        <w:t xml:space="preserve">can act</w:t>
+      </w:r>
+      <w:r>
+        <w:t xml:space="preserve">; check each can do only what the role allows, and the fund never shows them.</w:t>
+      </w:r>
+      <w:r>
+        <w:t xml:space="preserve"> </w:t>
+      </w:r>
+      <w:r>
+        <w:t xml:space="preserve">7.</w:t>
+      </w:r>
+      <w:r>
+        <w:t xml:space="preserve"> </w:t>
+      </w:r>
+      <w:r>
+        <w:rPr>
+          <w:b/>
+          <w:bCs/>
+        </w:rPr>
+        <w:t xml:space="preserve">Rights.</w:t>
+      </w:r>
+      <w:r>
+        <w:t xml:space="preserve"> </w:t>
+      </w:r>
+      <w:r>
+        <w:rPr>
+          <w:i/>
+          <w:iCs/>
+        </w:rPr>
+        <w:t xml:space="preserve">Download my data</w:t>
+      </w:r>
+      <w:r>
+        <w:t xml:space="preserve"> </w:t>
+      </w:r>
+      <w:r>
+        <w:t xml:space="preserve">(check the file); then</w:t>
+      </w:r>
+      <w:r>
+        <w:t xml:space="preserve"> </w:t>
+      </w:r>
+      <w:r>
+        <w:rPr>
+          <w:i/>
+          <w:iCs/>
+        </w:rPr>
+        <w:t xml:space="preserve">Delete my investor account</w:t>
+      </w:r>
+      <w:r>
+        <w:t xml:space="preserve"> </w:t>
+      </w:r>
+      <w:r>
+        <w:t xml:space="preserve">on a throwaway investor; check the fund’s record is anonymised and the sign-in is gone.</w:t>
+      </w:r>
+      <w:r>
+        <w:t xml:space="preserve"> </w:t>
+      </w:r>
+      <w:r>
+        <w:t xml:space="preserve">8.</w:t>
+      </w:r>
+      <w:r>
+        <w:t xml:space="preserve"> </w:t>
+      </w:r>
+      <w:r>
+        <w:rPr>
+          <w:b/>
+          <w:bCs/>
+        </w:rPr>
+        <w:t xml:space="preserve">Close again.</w:t>
+      </w:r>
+      <w:r>
+        <w:t xml:space="preserve"> </w:t>
+      </w:r>
+      <w:r>
+        <w:t xml:space="preserve">Set</w:t>
+      </w:r>
+      <w:r>
+        <w:t xml:space="preserve"> </w:t>
+      </w:r>
+      <w:r>
+        <w:rPr>
+          <w:rStyle w:val="VerbatimChar"/>
+        </w:rPr>
+        <w:t xml:space="preserve">investor_signup</w:t>
+      </w:r>
+      <w:r>
+        <w:t xml:space="preserve"> </w:t>
+      </w:r>
+      <w:r>
+        <w:t xml:space="preserve">and the other flags back to off (or leave sign-up open if that is the decision), delete the throwaway fund’s listing, and run</w:t>
+      </w:r>
+      <w:r>
+        <w:t xml:space="preserve"> </w:t>
+      </w:r>
+      <w:r>
+        <w:rPr>
+          <w:rStyle w:val="VerbatimChar"/>
+        </w:rPr>
+        <w:t xml:space="preserve">GET /api/cron/investor-retention?dry=1</w:t>
+      </w:r>
+      <w:r>
+        <w:t xml:space="preserve"> </w:t>
+      </w:r>
+      <w:r>
+        <w:t xml:space="preserve">with the cron secret to see the retention counts.</w:t>
+      </w:r>
+    </w:p>
+    <w:bookmarkEnd w:id="161"/>
+    <w:bookmarkStart w:id="162" w:name="e.-opening"/>
+    <w:p>
+      <w:pPr>
+        <w:pStyle w:val="Heading2"/>
+      </w:pPr>
+      <w:r>
+        <w:t xml:space="preserve">E. Opening</w:t>
+      </w:r>
+    </w:p>
+    <w:p>
+      <w:pPr>
+        <w:pStyle w:val="Compact"/>
+        <w:numPr>
+          <w:ilvl w:val="0"/>
+          <w:numId w:val="1044"/>
+        </w:numPr>
+      </w:pPr>
+      <w:r>
+        <w:t xml:space="preserve">In this order, each as its own decision:</w:t>
+      </w:r>
+      <w:r>
+        <w:t xml:space="preserve"> </w:t>
+      </w:r>
+      <w:r>
+        <w:rPr>
+          <w:rStyle w:val="VerbatimChar"/>
+        </w:rPr>
+        <w:t xml:space="preserve">investor_signup</w:t>
+      </w:r>
+      <w:r>
+        <w:t xml:space="preserve">; then a first real fund’s</w:t>
+      </w:r>
+      <w:r>
+        <w:t xml:space="preserve"> </w:t>
+      </w:r>
+      <w:r>
+        <w:rPr>
+          <w:i/>
+          <w:iCs/>
+        </w:rPr>
+        <w:t xml:space="preserve">Show to investors</w:t>
+      </w:r>
+      <w:r>
+        <w:t xml:space="preserve">; then, after the counsel answers on it and enough investors exist,</w:t>
+      </w:r>
+      <w:r>
+        <w:t xml:space="preserve"> </w:t>
+      </w:r>
+      <w:r>
+        <w:rPr>
+          <w:rStyle w:val="VerbatimChar"/>
+        </w:rPr>
+        <w:t xml:space="preserve">investor_discoverability</w:t>
+      </w:r>
+      <w:r>
+        <w:t xml:space="preserve">; the passport last.</w:t>
+      </w:r>
+    </w:p>
+    <w:bookmarkEnd w:id="162"/>
+    <w:bookmarkEnd w:id="163"/>
     <w:sectPr>
       <w:footnotePr>
         <w:numRestart w:val="eachSect"/>
@@ -13919,6 +15101,261 @@
     </w:lvl>
     <w:lvl w:ilvl="8">
       <w:start w:val="25"/>
+      <w:numFmt w:val="decimal"/>
+      <w:lvlText w:val="%9."/>
+      <w:lvlJc w:val="left"/>
+      <w:pPr>
+        <w:ind w:left="6480" w:hanging="360"/>
+      </w:pPr>
+    </w:lvl>
+  </w:abstractNum>
+  <w:abstractNum w:abstractNumId="99413">
+    <w:nsid w:val="00A99413"/>
+    <w:multiLevelType w:val="multilevel"/>
+    <w:lvl w:ilvl="0">
+      <w:start w:val="3"/>
+      <w:numFmt w:val="decimal"/>
+      <w:lvlText w:val="%1."/>
+      <w:lvlJc w:val="left"/>
+      <w:pPr>
+        <w:ind w:left="720" w:hanging="360"/>
+      </w:pPr>
+    </w:lvl>
+    <w:lvl w:ilvl="1">
+      <w:start w:val="3"/>
+      <w:numFmt w:val="decimal"/>
+      <w:lvlText w:val="%2."/>
+      <w:lvlJc w:val="left"/>
+      <w:pPr>
+        <w:ind w:left="1440" w:hanging="360"/>
+      </w:pPr>
+    </w:lvl>
+    <w:lvl w:ilvl="2">
+      <w:start w:val="3"/>
+      <w:numFmt w:val="decimal"/>
+      <w:lvlText w:val="%3."/>
+      <w:lvlJc w:val="left"/>
+      <w:pPr>
+        <w:ind w:left="2160" w:hanging="360"/>
+      </w:pPr>
+    </w:lvl>
+    <w:lvl w:ilvl="3">
+      <w:start w:val="3"/>
+      <w:numFmt w:val="decimal"/>
+      <w:lvlText w:val="%4."/>
+      <w:lvlJc w:val="left"/>
+      <w:pPr>
+        <w:ind w:left="2880" w:hanging="360"/>
+      </w:pPr>
+    </w:lvl>
+    <w:lvl w:ilvl="4">
+      <w:start w:val="3"/>
+      <w:numFmt w:val="decimal"/>
+      <w:lvlText w:val="%5."/>
+      <w:lvlJc w:val="left"/>
+      <w:pPr>
+        <w:ind w:left="3600" w:hanging="360"/>
+      </w:pPr>
+    </w:lvl>
+    <w:lvl w:ilvl="5">
+      <w:start w:val="3"/>
+      <w:numFmt w:val="decimal"/>
+      <w:lvlText w:val="%6."/>
+      <w:lvlJc w:val="left"/>
+      <w:pPr>
+        <w:ind w:left="4320" w:hanging="360"/>
+      </w:pPr>
+    </w:lvl>
+    <w:lvl w:ilvl="6">
+      <w:start w:val="3"/>
+      <w:numFmt w:val="decimal"/>
+      <w:lvlText w:val="%7."/>
+      <w:lvlJc w:val="left"/>
+      <w:pPr>
+        <w:ind w:left="5040" w:hanging="360"/>
+      </w:pPr>
+    </w:lvl>
+    <w:lvl w:ilvl="7">
+      <w:start w:val="3"/>
+      <w:numFmt w:val="decimal"/>
+      <w:lvlText w:val="%8."/>
+      <w:lvlJc w:val="left"/>
+      <w:pPr>
+        <w:ind w:left="5760" w:hanging="360"/>
+      </w:pPr>
+    </w:lvl>
+    <w:lvl w:ilvl="8">
+      <w:start w:val="3"/>
+      <w:numFmt w:val="decimal"/>
+      <w:lvlText w:val="%9."/>
+      <w:lvlJc w:val="left"/>
+      <w:pPr>
+        <w:ind w:left="6480" w:hanging="360"/>
+      </w:pPr>
+    </w:lvl>
+  </w:abstractNum>
+  <w:abstractNum w:abstractNumId="99416">
+    <w:nsid w:val="00A99416"/>
+    <w:multiLevelType w:val="multilevel"/>
+    <w:lvl w:ilvl="0">
+      <w:start w:val="6"/>
+      <w:numFmt w:val="decimal"/>
+      <w:lvlText w:val="%1."/>
+      <w:lvlJc w:val="left"/>
+      <w:pPr>
+        <w:ind w:left="720" w:hanging="360"/>
+      </w:pPr>
+    </w:lvl>
+    <w:lvl w:ilvl="1">
+      <w:start w:val="6"/>
+      <w:numFmt w:val="decimal"/>
+      <w:lvlText w:val="%2."/>
+      <w:lvlJc w:val="left"/>
+      <w:pPr>
+        <w:ind w:left="1440" w:hanging="360"/>
+      </w:pPr>
+    </w:lvl>
+    <w:lvl w:ilvl="2">
+      <w:start w:val="6"/>
+      <w:numFmt w:val="decimal"/>
+      <w:lvlText w:val="%3."/>
+      <w:lvlJc w:val="left"/>
+      <w:pPr>
+        <w:ind w:left="2160" w:hanging="360"/>
+      </w:pPr>
+    </w:lvl>
+    <w:lvl w:ilvl="3">
+      <w:start w:val="6"/>
+      <w:numFmt w:val="decimal"/>
+      <w:lvlText w:val="%4."/>
+      <w:lvlJc w:val="left"/>
+      <w:pPr>
+        <w:ind w:left="2880" w:hanging="360"/>
+      </w:pPr>
+    </w:lvl>
+    <w:lvl w:ilvl="4">
+      <w:start w:val="6"/>
+      <w:numFmt w:val="decimal"/>
+      <w:lvlText w:val="%5."/>
+      <w:lvlJc w:val="left"/>
+      <w:pPr>
+        <w:ind w:left="3600" w:hanging="360"/>
+      </w:pPr>
+    </w:lvl>
+    <w:lvl w:ilvl="5">
+      <w:start w:val="6"/>
+      <w:numFmt w:val="decimal"/>
+      <w:lvlText w:val="%6."/>
+      <w:lvlJc w:val="left"/>
+      <w:pPr>
+        <w:ind w:left="4320" w:hanging="360"/>
+      </w:pPr>
+    </w:lvl>
+    <w:lvl w:ilvl="6">
+      <w:start w:val="6"/>
+      <w:numFmt w:val="decimal"/>
+      <w:lvlText w:val="%7."/>
+      <w:lvlJc w:val="left"/>
+      <w:pPr>
+        <w:ind w:left="5040" w:hanging="360"/>
+      </w:pPr>
+    </w:lvl>
+    <w:lvl w:ilvl="7">
+      <w:start w:val="6"/>
+      <w:numFmt w:val="decimal"/>
+      <w:lvlText w:val="%8."/>
+      <w:lvlJc w:val="left"/>
+      <w:pPr>
+        <w:ind w:left="5760" w:hanging="360"/>
+      </w:pPr>
+    </w:lvl>
+    <w:lvl w:ilvl="8">
+      <w:start w:val="6"/>
+      <w:numFmt w:val="decimal"/>
+      <w:lvlText w:val="%9."/>
+      <w:lvlJc w:val="left"/>
+      <w:pPr>
+        <w:ind w:left="6480" w:hanging="360"/>
+      </w:pPr>
+    </w:lvl>
+  </w:abstractNum>
+  <w:abstractNum w:abstractNumId="99419">
+    <w:nsid w:val="00A99419"/>
+    <w:multiLevelType w:val="multilevel"/>
+    <w:lvl w:ilvl="0">
+      <w:start w:val="9"/>
+      <w:numFmt w:val="decimal"/>
+      <w:lvlText w:val="%1."/>
+      <w:lvlJc w:val="left"/>
+      <w:pPr>
+        <w:ind w:left="720" w:hanging="360"/>
+      </w:pPr>
+    </w:lvl>
+    <w:lvl w:ilvl="1">
+      <w:start w:val="9"/>
+      <w:numFmt w:val="decimal"/>
+      <w:lvlText w:val="%2."/>
+      <w:lvlJc w:val="left"/>
+      <w:pPr>
+        <w:ind w:left="1440" w:hanging="360"/>
+      </w:pPr>
+    </w:lvl>
+    <w:lvl w:ilvl="2">
+      <w:start w:val="9"/>
+      <w:numFmt w:val="decimal"/>
+      <w:lvlText w:val="%3."/>
+      <w:lvlJc w:val="left"/>
+      <w:pPr>
+        <w:ind w:left="2160" w:hanging="360"/>
+      </w:pPr>
+    </w:lvl>
+    <w:lvl w:ilvl="3">
+      <w:start w:val="9"/>
+      <w:numFmt w:val="decimal"/>
+      <w:lvlText w:val="%4."/>
+      <w:lvlJc w:val="left"/>
+      <w:pPr>
+        <w:ind w:left="2880" w:hanging="360"/>
+      </w:pPr>
+    </w:lvl>
+    <w:lvl w:ilvl="4">
+      <w:start w:val="9"/>
+      <w:numFmt w:val="decimal"/>
+      <w:lvlText w:val="%5."/>
+      <w:lvlJc w:val="left"/>
+      <w:pPr>
+        <w:ind w:left="3600" w:hanging="360"/>
+      </w:pPr>
+    </w:lvl>
+    <w:lvl w:ilvl="5">
+      <w:start w:val="9"/>
+      <w:numFmt w:val="decimal"/>
+      <w:lvlText w:val="%6."/>
+      <w:lvlJc w:val="left"/>
+      <w:pPr>
+        <w:ind w:left="4320" w:hanging="360"/>
+      </w:pPr>
+    </w:lvl>
+    <w:lvl w:ilvl="6">
+      <w:start w:val="9"/>
+      <w:numFmt w:val="decimal"/>
+      <w:lvlText w:val="%7."/>
+      <w:lvlJc w:val="left"/>
+      <w:pPr>
+        <w:ind w:left="5040" w:hanging="360"/>
+      </w:pPr>
+    </w:lvl>
+    <w:lvl w:ilvl="7">
+      <w:start w:val="9"/>
+      <w:numFmt w:val="decimal"/>
+      <w:lvlText w:val="%8."/>
+      <w:lvlJc w:val="left"/>
+      <w:pPr>
+        <w:ind w:left="5760" w:hanging="360"/>
+      </w:pPr>
+    </w:lvl>
+    <w:lvl w:ilvl="8">
+      <w:start w:val="9"/>
       <w:numFmt w:val="decimal"/>
       <w:lvlText w:val="%9."/>
       <w:lvlJc w:val="left"/>
@@ -14453,6 +15890,126 @@
     </w:lvlOverride>
     <w:lvlOverride w:ilvl="8">
       <w:startOverride w:val="1"/>
+    </w:lvlOverride>
+  </w:num>
+  <w:num w:numId="1041">
+    <w:abstractNumId w:val="99411"/>
+    <w:lvlOverride w:ilvl="0">
+      <w:startOverride w:val="1"/>
+    </w:lvlOverride>
+    <w:lvlOverride w:ilvl="1">
+      <w:startOverride w:val="1"/>
+    </w:lvlOverride>
+    <w:lvlOverride w:ilvl="2">
+      <w:startOverride w:val="1"/>
+    </w:lvlOverride>
+    <w:lvlOverride w:ilvl="3">
+      <w:startOverride w:val="1"/>
+    </w:lvlOverride>
+    <w:lvlOverride w:ilvl="4">
+      <w:startOverride w:val="1"/>
+    </w:lvlOverride>
+    <w:lvlOverride w:ilvl="5">
+      <w:startOverride w:val="1"/>
+    </w:lvlOverride>
+    <w:lvlOverride w:ilvl="6">
+      <w:startOverride w:val="1"/>
+    </w:lvlOverride>
+    <w:lvlOverride w:ilvl="7">
+      <w:startOverride w:val="1"/>
+    </w:lvlOverride>
+    <w:lvlOverride w:ilvl="8">
+      <w:startOverride w:val="1"/>
+    </w:lvlOverride>
+  </w:num>
+  <w:num w:numId="1042">
+    <w:abstractNumId w:val="99413"/>
+    <w:lvlOverride w:ilvl="0">
+      <w:startOverride w:val="3"/>
+    </w:lvlOverride>
+    <w:lvlOverride w:ilvl="1">
+      <w:startOverride w:val="3"/>
+    </w:lvlOverride>
+    <w:lvlOverride w:ilvl="2">
+      <w:startOverride w:val="3"/>
+    </w:lvlOverride>
+    <w:lvlOverride w:ilvl="3">
+      <w:startOverride w:val="3"/>
+    </w:lvlOverride>
+    <w:lvlOverride w:ilvl="4">
+      <w:startOverride w:val="3"/>
+    </w:lvlOverride>
+    <w:lvlOverride w:ilvl="5">
+      <w:startOverride w:val="3"/>
+    </w:lvlOverride>
+    <w:lvlOverride w:ilvl="6">
+      <w:startOverride w:val="3"/>
+    </w:lvlOverride>
+    <w:lvlOverride w:ilvl="7">
+      <w:startOverride w:val="3"/>
+    </w:lvlOverride>
+    <w:lvlOverride w:ilvl="8">
+      <w:startOverride w:val="3"/>
+    </w:lvlOverride>
+  </w:num>
+  <w:num w:numId="1043">
+    <w:abstractNumId w:val="99416"/>
+    <w:lvlOverride w:ilvl="0">
+      <w:startOverride w:val="6"/>
+    </w:lvlOverride>
+    <w:lvlOverride w:ilvl="1">
+      <w:startOverride w:val="6"/>
+    </w:lvlOverride>
+    <w:lvlOverride w:ilvl="2">
+      <w:startOverride w:val="6"/>
+    </w:lvlOverride>
+    <w:lvlOverride w:ilvl="3">
+      <w:startOverride w:val="6"/>
+    </w:lvlOverride>
+    <w:lvlOverride w:ilvl="4">
+      <w:startOverride w:val="6"/>
+    </w:lvlOverride>
+    <w:lvlOverride w:ilvl="5">
+      <w:startOverride w:val="6"/>
+    </w:lvlOverride>
+    <w:lvlOverride w:ilvl="6">
+      <w:startOverride w:val="6"/>
+    </w:lvlOverride>
+    <w:lvlOverride w:ilvl="7">
+      <w:startOverride w:val="6"/>
+    </w:lvlOverride>
+    <w:lvlOverride w:ilvl="8">
+      <w:startOverride w:val="6"/>
+    </w:lvlOverride>
+  </w:num>
+  <w:num w:numId="1044">
+    <w:abstractNumId w:val="99419"/>
+    <w:lvlOverride w:ilvl="0">
+      <w:startOverride w:val="9"/>
+    </w:lvlOverride>
+    <w:lvlOverride w:ilvl="1">
+      <w:startOverride w:val="9"/>
+    </w:lvlOverride>
+    <w:lvlOverride w:ilvl="2">
+      <w:startOverride w:val="9"/>
+    </w:lvlOverride>
+    <w:lvlOverride w:ilvl="3">
+      <w:startOverride w:val="9"/>
+    </w:lvlOverride>
+    <w:lvlOverride w:ilvl="4">
+      <w:startOverride w:val="9"/>
+    </w:lvlOverride>
+    <w:lvlOverride w:ilvl="5">
+      <w:startOverride w:val="9"/>
+    </w:lvlOverride>
+    <w:lvlOverride w:ilvl="6">
+      <w:startOverride w:val="9"/>
+    </w:lvlOverride>
+    <w:lvlOverride w:ilvl="7">
+      <w:startOverride w:val="9"/>
+    </w:lvlOverride>
+    <w:lvlOverride w:ilvl="8">
+      <w:startOverride w:val="9"/>
     </w:lvlOverride>
   </w:num>
 </w:numbering>

</xml_diff>